<commit_message>
Angol szöveg megírása késsz
</commit_message>
<xml_diff>
--- a/Szöveg/Oldal szövege.docx
+++ b/Szöveg/Oldal szövege.docx
@@ -2,6 +2,24 @@
 <file path=word/document.xml><?xml version="1.0" encoding="utf-8"?>
 <w:document xmlns:wpc="http://schemas.microsoft.com/office/word/2010/wordprocessingCanvas" xmlns:cx="http://schemas.microsoft.com/office/drawing/2014/chartex" xmlns:cx1="http://schemas.microsoft.com/office/drawing/2015/9/8/chartex" xmlns:cx2="http://schemas.microsoft.com/office/drawing/2015/10/21/chartex" xmlns:cx3="http://schemas.microsoft.com/office/drawing/2016/5/9/chartex" xmlns:cx4="http://schemas.microsoft.com/office/drawing/2016/5/10/chartex" xmlns:cx5="http://schemas.microsoft.com/office/drawing/2016/5/11/chartex" xmlns:cx6="http://schemas.microsoft.com/office/drawing/2016/5/12/chartex" xmlns:cx7="http://schemas.microsoft.com/office/drawing/2016/5/13/chartex" xmlns:cx8="http://schemas.microsoft.com/office/drawing/2016/5/14/chartex" xmlns:mc="http://schemas.openxmlformats.org/markup-compatibility/2006" xmlns:m="http://schemas.openxmlformats.org/officeDocument/2006/math" xmlns:aink="http://schemas.microsoft.com/office/drawing/2016/ink" xmlns:am3d="http://schemas.microsoft.com/office/drawing/2017/model3d" xmlns:oel="http://schemas.microsoft.com/office/2019/extlst" xmlns:r="http://schemas.openxmlformats.org/officeDocument/2006/relationships" xmlns:wp14="http://schemas.microsoft.com/office/word/2010/wordprocessingDrawing" xmlns:wp="http://schemas.openxmlformats.org/drawingml/2006/wordprocessingDrawing" xmlns:wpg="http://schemas.microsoft.com/office/word/2010/wordprocessingGroup" xmlns:wpi="http://schemas.microsoft.com/office/word/2010/wordprocessingInk" xmlns:wps="http://schemas.microsoft.com/office/word/2010/wordprocessingShape" xmlns:o="urn:schemas-microsoft-com:office:office" xmlns:v="urn:schemas-microsoft-com:vml" xmlns:w10="urn:schemas-microsoft-com:office:word" xmlns:w="http://schemas.openxmlformats.org/wordprocessingml/2006/main" xmlns:w14="http://schemas.microsoft.com/office/word/2010/wordml" xmlns:w15="http://schemas.microsoft.com/office/word/2012/wordml" xmlns:w16cex="http://schemas.microsoft.com/office/word/2018/wordml/cex" xmlns:w16cid="http://schemas.microsoft.com/office/word/2016/wordml/cid" xmlns:w16="http://schemas.microsoft.com/office/word/2018/wordml" xmlns:w16sdtdh="http://schemas.microsoft.com/office/word/2020/wordml/sdtdatahash" xmlns:w16sdtfl="http://schemas.microsoft.com/office/word/2024/wordml/sdtformatlock" xmlns:w16se="http://schemas.microsoft.com/office/word/2015/wordml/symex" xmlns:w16du="http://schemas.microsoft.com/office/word/2023/wordml/word16du" xmlns:wne="http://schemas.microsoft.com/office/word/2006/wordml" mc:Ignorable="w14 w15 w16se w16cid w16 w16cex w16sdtdh w16sdtfl w16du wp14">
   <w:body>
+    <w:p>
+      <w:pPr>
+        <w:jc w:val="center"/>
+        <w:rPr>
+          <w:rFonts w:ascii="Times New Roman" w:hAnsi="Times New Roman" w:cs="Times New Roman"/>
+          <w:sz w:val="48"/>
+          <w:szCs w:val="48"/>
+        </w:rPr>
+      </w:pPr>
+      <w:r>
+        <w:rPr>
+          <w:rFonts w:ascii="Times New Roman" w:hAnsi="Times New Roman" w:cs="Times New Roman"/>
+          <w:sz w:val="48"/>
+          <w:szCs w:val="48"/>
+        </w:rPr>
+        <w:t>Magyar</w:t>
+      </w:r>
+    </w:p>
     <w:p>
       <w:pPr>
         <w:rPr>
@@ -661,6 +679,923 @@
         <w:ind w:left="993"/>
         <w:rPr>
           <w:color w:val="000000"/>
+        </w:rPr>
+      </w:pPr>
+    </w:p>
+    <w:p>
+      <w:pPr>
+        <w:jc w:val="center"/>
+        <w:rPr>
+          <w:rFonts w:ascii="Times New Roman" w:hAnsi="Times New Roman" w:cs="Times New Roman"/>
+          <w:sz w:val="48"/>
+          <w:szCs w:val="48"/>
+        </w:rPr>
+      </w:pPr>
+      <w:r>
+        <w:rPr>
+          <w:rFonts w:ascii="Times New Roman" w:hAnsi="Times New Roman" w:cs="Times New Roman"/>
+          <w:sz w:val="48"/>
+          <w:szCs w:val="48"/>
+        </w:rPr>
+        <w:lastRenderedPageBreak/>
+        <w:t>English</w:t>
+      </w:r>
+    </w:p>
+    <w:p>
+      <w:pPr>
+        <w:rPr>
+          <w:rFonts w:ascii="Times New Roman" w:hAnsi="Times New Roman" w:cs="Times New Roman"/>
+          <w:sz w:val="32"/>
+          <w:szCs w:val="32"/>
+          <w:u w:val="single"/>
+        </w:rPr>
+      </w:pPr>
+      <w:r>
+        <w:rPr>
+          <w:rFonts w:ascii="Times New Roman" w:hAnsi="Times New Roman" w:cs="Times New Roman"/>
+          <w:sz w:val="32"/>
+          <w:szCs w:val="32"/>
+          <w:u w:val="single"/>
+        </w:rPr>
+        <w:t>Fejléc:</w:t>
+      </w:r>
+    </w:p>
+    <w:p>
+      <w:pPr>
+        <w:pStyle w:val="Listaszerbekezds"/>
+        <w:numPr>
+          <w:ilvl w:val="0"/>
+          <w:numId w:val="1"/>
+        </w:numPr>
+        <w:rPr>
+          <w:rFonts w:ascii="Times New Roman" w:hAnsi="Times New Roman" w:cs="Times New Roman"/>
+        </w:rPr>
+      </w:pPr>
+      <w:r>
+        <w:rPr>
+          <w:rFonts w:ascii="Times New Roman" w:hAnsi="Times New Roman" w:cs="Times New Roman"/>
+        </w:rPr>
+        <w:t>Home</w:t>
+      </w:r>
+    </w:p>
+    <w:p>
+      <w:pPr>
+        <w:pStyle w:val="Listaszerbekezds"/>
+        <w:numPr>
+          <w:ilvl w:val="0"/>
+          <w:numId w:val="1"/>
+        </w:numPr>
+        <w:rPr>
+          <w:rFonts w:ascii="Times New Roman" w:hAnsi="Times New Roman" w:cs="Times New Roman"/>
+        </w:rPr>
+      </w:pPr>
+      <w:proofErr w:type="spellStart"/>
+      <w:r>
+        <w:rPr>
+          <w:rFonts w:ascii="Times New Roman" w:hAnsi="Times New Roman" w:cs="Times New Roman"/>
+        </w:rPr>
+        <w:t>About</w:t>
+      </w:r>
+      <w:proofErr w:type="spellEnd"/>
+      <w:r>
+        <w:rPr>
+          <w:rFonts w:ascii="Times New Roman" w:hAnsi="Times New Roman" w:cs="Times New Roman"/>
+        </w:rPr>
+        <w:t xml:space="preserve"> </w:t>
+      </w:r>
+      <w:proofErr w:type="spellStart"/>
+      <w:r>
+        <w:rPr>
+          <w:rFonts w:ascii="Times New Roman" w:hAnsi="Times New Roman" w:cs="Times New Roman"/>
+        </w:rPr>
+        <w:t>Me</w:t>
+      </w:r>
+      <w:proofErr w:type="spellEnd"/>
+    </w:p>
+    <w:p>
+      <w:pPr>
+        <w:pStyle w:val="Listaszerbekezds"/>
+        <w:numPr>
+          <w:ilvl w:val="0"/>
+          <w:numId w:val="1"/>
+        </w:numPr>
+        <w:rPr>
+          <w:rFonts w:ascii="Times New Roman" w:hAnsi="Times New Roman" w:cs="Times New Roman"/>
+        </w:rPr>
+      </w:pPr>
+      <w:proofErr w:type="spellStart"/>
+      <w:r>
+        <w:rPr>
+          <w:rFonts w:ascii="Times New Roman" w:hAnsi="Times New Roman" w:cs="Times New Roman"/>
+        </w:rPr>
+        <w:t>Portfolio</w:t>
+      </w:r>
+      <w:proofErr w:type="spellEnd"/>
+    </w:p>
+    <w:p>
+      <w:pPr>
+        <w:pStyle w:val="Listaszerbekezds"/>
+        <w:numPr>
+          <w:ilvl w:val="0"/>
+          <w:numId w:val="1"/>
+        </w:numPr>
+        <w:rPr>
+          <w:rFonts w:ascii="Times New Roman" w:hAnsi="Times New Roman" w:cs="Times New Roman"/>
+        </w:rPr>
+      </w:pPr>
+      <w:proofErr w:type="spellStart"/>
+      <w:r>
+        <w:rPr>
+          <w:rFonts w:ascii="Times New Roman" w:hAnsi="Times New Roman" w:cs="Times New Roman"/>
+        </w:rPr>
+        <w:t>Testimonials</w:t>
+      </w:r>
+      <w:proofErr w:type="spellEnd"/>
+    </w:p>
+    <w:p>
+      <w:pPr>
+        <w:pStyle w:val="Listaszerbekezds"/>
+        <w:numPr>
+          <w:ilvl w:val="0"/>
+          <w:numId w:val="1"/>
+        </w:numPr>
+        <w:rPr>
+          <w:rFonts w:ascii="Times New Roman" w:hAnsi="Times New Roman" w:cs="Times New Roman"/>
+        </w:rPr>
+      </w:pPr>
+      <w:proofErr w:type="spellStart"/>
+      <w:r>
+        <w:rPr>
+          <w:rFonts w:ascii="Times New Roman" w:hAnsi="Times New Roman" w:cs="Times New Roman"/>
+        </w:rPr>
+        <w:t>Quote</w:t>
+      </w:r>
+      <w:proofErr w:type="spellEnd"/>
+    </w:p>
+    <w:p>
+      <w:pPr>
+        <w:pStyle w:val="Listaszerbekezds"/>
+        <w:numPr>
+          <w:ilvl w:val="0"/>
+          <w:numId w:val="1"/>
+        </w:numPr>
+        <w:rPr>
+          <w:rFonts w:ascii="Times New Roman" w:hAnsi="Times New Roman" w:cs="Times New Roman"/>
+        </w:rPr>
+      </w:pPr>
+      <w:proofErr w:type="spellStart"/>
+      <w:r>
+        <w:rPr>
+          <w:rFonts w:ascii="Times New Roman" w:hAnsi="Times New Roman" w:cs="Times New Roman"/>
+        </w:rPr>
+        <w:t>Info</w:t>
+      </w:r>
+      <w:proofErr w:type="spellEnd"/>
+    </w:p>
+    <w:p>
+      <w:pPr>
+        <w:pStyle w:val="NormlWeb"/>
+        <w:rPr>
+          <w:rStyle w:val="apple-converted-space"/>
+          <w:color w:val="000000"/>
+        </w:rPr>
+      </w:pPr>
+      <w:r>
+        <w:rPr>
+          <w:rFonts w:eastAsiaTheme="minorHAnsi"/>
+          <w:kern w:val="2"/>
+          <w:sz w:val="32"/>
+          <w:szCs w:val="32"/>
+          <w:u w:val="single"/>
+          <w:lang w:eastAsia="en-US"/>
+          <w14:ligatures w14:val="standardContextual"/>
+        </w:rPr>
+        <w:t>Rólam szekció</w:t>
+      </w:r>
+      <w:r>
+        <w:rPr>
+          <w:b/>
+          <w:bCs/>
+          <w:color w:val="000000"/>
+        </w:rPr>
+        <w:t>:</w:t>
+      </w:r>
+      <w:r>
+        <w:rPr>
+          <w:rStyle w:val="apple-converted-space"/>
+          <w:color w:val="000000"/>
+        </w:rPr>
+        <w:t> </w:t>
+      </w:r>
+    </w:p>
+    <w:p>
+      <w:pPr>
+        <w:pStyle w:val="NormlWeb"/>
+        <w:rPr>
+          <w:color w:val="000000"/>
+        </w:rPr>
+      </w:pPr>
+      <w:r>
+        <w:rPr>
+          <w:i/>
+          <w:iCs/>
+          <w:color w:val="000000"/>
+        </w:rPr>
+        <w:t>Cím:</w:t>
+      </w:r>
+      <w:r>
+        <w:rPr>
+          <w:rStyle w:val="apple-converted-space"/>
+          <w:color w:val="000000"/>
+        </w:rPr>
+        <w:t> </w:t>
+      </w:r>
+      <w:r>
+        <w:rPr>
+          <w:rStyle w:val="HTML-kd"/>
+          <w:rFonts w:ascii="Times New Roman" w:hAnsi="Times New Roman" w:cs="Times New Roman"/>
+        </w:rPr>
+        <w:t xml:space="preserve">~ </w:t>
+      </w:r>
+      <w:proofErr w:type="spellStart"/>
+      <w:r>
+        <w:rPr>
+          <w:rStyle w:val="HTML-kd"/>
+          <w:rFonts w:ascii="Times New Roman" w:hAnsi="Times New Roman" w:cs="Times New Roman"/>
+        </w:rPr>
+        <w:t>Behind</w:t>
+      </w:r>
+      <w:proofErr w:type="spellEnd"/>
+      <w:r>
+        <w:rPr>
+          <w:rStyle w:val="HTML-kd"/>
+          <w:rFonts w:ascii="Times New Roman" w:hAnsi="Times New Roman" w:cs="Times New Roman"/>
+        </w:rPr>
+        <w:t xml:space="preserve"> </w:t>
+      </w:r>
+      <w:proofErr w:type="spellStart"/>
+      <w:r>
+        <w:rPr>
+          <w:rStyle w:val="HTML-kd"/>
+          <w:rFonts w:ascii="Times New Roman" w:hAnsi="Times New Roman" w:cs="Times New Roman"/>
+        </w:rPr>
+        <w:t>the</w:t>
+      </w:r>
+      <w:proofErr w:type="spellEnd"/>
+      <w:r>
+        <w:rPr>
+          <w:rStyle w:val="HTML-kd"/>
+          <w:rFonts w:ascii="Times New Roman" w:hAnsi="Times New Roman" w:cs="Times New Roman"/>
+        </w:rPr>
+        <w:t xml:space="preserve"> camera ~</w:t>
+      </w:r>
+    </w:p>
+    <w:p>
+      <w:pPr>
+        <w:pStyle w:val="NormlWeb"/>
+        <w:numPr>
+          <w:ilvl w:val="0"/>
+          <w:numId w:val="6"/>
+        </w:numPr>
+        <w:rPr>
+          <w:rStyle w:val="apple-converted-space"/>
+          <w:color w:val="000000"/>
+        </w:rPr>
+      </w:pPr>
+      <w:r>
+        <w:rPr>
+          <w:i/>
+          <w:iCs/>
+          <w:color w:val="000000"/>
+        </w:rPr>
+        <w:t>bekezdés:</w:t>
+      </w:r>
+      <w:r>
+        <w:rPr>
+          <w:rStyle w:val="apple-converted-space"/>
+          <w:color w:val="000000"/>
+        </w:rPr>
+        <w:t> </w:t>
+      </w:r>
+    </w:p>
+    <w:p>
+      <w:pPr>
+        <w:pStyle w:val="NormlWeb"/>
+        <w:ind w:left="720"/>
+        <w:rPr>
+          <w:color w:val="000000"/>
+          <w:lang w:val="en-GB"/>
+        </w:rPr>
+      </w:pPr>
+      <w:r>
+        <w:rPr>
+          <w:color w:val="000000"/>
+        </w:rPr>
+        <w:t xml:space="preserve">I am Balázs Kepenyes, a </w:t>
+      </w:r>
+      <w:proofErr w:type="spellStart"/>
+      <w:r>
+        <w:rPr>
+          <w:color w:val="000000"/>
+        </w:rPr>
+        <w:t>freelance</w:t>
+      </w:r>
+      <w:proofErr w:type="spellEnd"/>
+      <w:r>
+        <w:rPr>
+          <w:color w:val="000000"/>
+        </w:rPr>
+        <w:t xml:space="preserve"> </w:t>
+      </w:r>
+      <w:proofErr w:type="spellStart"/>
+      <w:r>
+        <w:rPr>
+          <w:color w:val="000000"/>
+        </w:rPr>
+        <w:t>photographer</w:t>
+      </w:r>
+      <w:proofErr w:type="spellEnd"/>
+      <w:r>
+        <w:rPr>
+          <w:color w:val="000000"/>
+        </w:rPr>
+        <w:t xml:space="preserve">. </w:t>
+      </w:r>
+      <w:proofErr w:type="spellStart"/>
+      <w:r>
+        <w:rPr>
+          <w:color w:val="000000"/>
+        </w:rPr>
+        <w:t>For</w:t>
+      </w:r>
+      <w:proofErr w:type="spellEnd"/>
+      <w:r>
+        <w:rPr>
+          <w:color w:val="000000"/>
+        </w:rPr>
+        <w:t xml:space="preserve"> </w:t>
+      </w:r>
+      <w:proofErr w:type="spellStart"/>
+      <w:r>
+        <w:rPr>
+          <w:color w:val="000000"/>
+        </w:rPr>
+        <w:t>me</w:t>
+      </w:r>
+      <w:proofErr w:type="spellEnd"/>
+      <w:r>
+        <w:rPr>
+          <w:color w:val="000000"/>
+        </w:rPr>
+        <w:t xml:space="preserve">, </w:t>
+      </w:r>
+      <w:proofErr w:type="spellStart"/>
+      <w:r>
+        <w:rPr>
+          <w:color w:val="000000"/>
+        </w:rPr>
+        <w:t>photography</w:t>
+      </w:r>
+      <w:proofErr w:type="spellEnd"/>
+      <w:r>
+        <w:rPr>
+          <w:color w:val="000000"/>
+        </w:rPr>
+        <w:t xml:space="preserve"> is more </w:t>
+      </w:r>
+      <w:proofErr w:type="spellStart"/>
+      <w:r>
+        <w:rPr>
+          <w:color w:val="000000"/>
+        </w:rPr>
+        <w:t>than</w:t>
+      </w:r>
+      <w:proofErr w:type="spellEnd"/>
+      <w:r>
+        <w:rPr>
+          <w:color w:val="000000"/>
+        </w:rPr>
+        <w:t xml:space="preserve"> </w:t>
+      </w:r>
+      <w:r>
+        <w:rPr>
+          <w:color w:val="000000"/>
+          <w:lang w:val="en-GB"/>
+        </w:rPr>
+        <w:t>just pressing a button; it's about capturing unrepeatable moments and genuine emotions. Whether it's a dynamic sports event, an unforgettable party, or the most important day of your life—your wedding—my goal is always to tell a real story through my images.</w:t>
+      </w:r>
+    </w:p>
+    <w:p>
+      <w:pPr>
+        <w:pStyle w:val="NormlWeb"/>
+        <w:numPr>
+          <w:ilvl w:val="0"/>
+          <w:numId w:val="6"/>
+        </w:numPr>
+        <w:rPr>
+          <w:rStyle w:val="apple-converted-space"/>
+          <w:color w:val="000000"/>
+        </w:rPr>
+      </w:pPr>
+      <w:r>
+        <w:rPr>
+          <w:i/>
+          <w:iCs/>
+          <w:color w:val="000000"/>
+        </w:rPr>
+        <w:t>bekezdés:</w:t>
+      </w:r>
+      <w:r>
+        <w:rPr>
+          <w:rStyle w:val="apple-converted-space"/>
+          <w:color w:val="000000"/>
+        </w:rPr>
+        <w:t> </w:t>
+      </w:r>
+    </w:p>
+    <w:p>
+      <w:pPr>
+        <w:pStyle w:val="NormlWeb"/>
+        <w:ind w:left="720"/>
+        <w:rPr>
+          <w:color w:val="000000"/>
+          <w:lang w:val="en-GB"/>
+        </w:rPr>
+      </w:pPr>
+      <w:r>
+        <w:rPr>
+          <w:color w:val="000000"/>
+          <w:lang w:val="en-GB"/>
+        </w:rPr>
+        <w:t>In my work, I strive for a natural, clean, and premium visual style. I know that standing in front of a camera can often be intimidating, which is why creating a relaxed, stress-free atmosphere during my shoots is paramount. I believe the most beautiful shots are born when you let go and can truly be yourself.</w:t>
+      </w:r>
+    </w:p>
+    <w:p>
+      <w:pPr>
+        <w:pStyle w:val="NormlWeb"/>
+        <w:rPr>
+          <w:rFonts w:eastAsiaTheme="minorHAnsi"/>
+          <w:kern w:val="2"/>
+          <w:sz w:val="32"/>
+          <w:szCs w:val="32"/>
+          <w:u w:val="single"/>
+          <w:lang w:eastAsia="en-US"/>
+          <w14:ligatures w14:val="standardContextual"/>
+        </w:rPr>
+      </w:pPr>
+      <w:r>
+        <w:rPr>
+          <w:rFonts w:eastAsiaTheme="minorHAnsi"/>
+          <w:kern w:val="2"/>
+          <w:sz w:val="32"/>
+          <w:szCs w:val="32"/>
+          <w:u w:val="single"/>
+          <w:lang w:eastAsia="en-US"/>
+          <w14:ligatures w14:val="standardContextual"/>
+        </w:rPr>
+        <w:t>Portfólió (Kategóriák):</w:t>
+      </w:r>
+    </w:p>
+    <w:p>
+      <w:pPr>
+        <w:pStyle w:val="NormlWeb"/>
+        <w:numPr>
+          <w:ilvl w:val="0"/>
+          <w:numId w:val="5"/>
+        </w:numPr>
+        <w:rPr>
+          <w:color w:val="000000"/>
+        </w:rPr>
+      </w:pPr>
+      <w:r>
+        <w:rPr>
+          <w:b/>
+          <w:bCs/>
+          <w:color w:val="000000"/>
+        </w:rPr>
+        <w:t>EVENTS</w:t>
+      </w:r>
+    </w:p>
+    <w:p>
+      <w:pPr>
+        <w:pStyle w:val="NormlWeb"/>
+        <w:numPr>
+          <w:ilvl w:val="0"/>
+          <w:numId w:val="5"/>
+        </w:numPr>
+        <w:rPr>
+          <w:color w:val="000000"/>
+        </w:rPr>
+      </w:pPr>
+      <w:r>
+        <w:rPr>
+          <w:b/>
+          <w:bCs/>
+          <w:color w:val="000000"/>
+        </w:rPr>
+        <w:t>SPORTS PHOTOGRAPHY</w:t>
+      </w:r>
+    </w:p>
+    <w:p>
+      <w:pPr>
+        <w:pStyle w:val="NormlWeb"/>
+        <w:numPr>
+          <w:ilvl w:val="0"/>
+          <w:numId w:val="5"/>
+        </w:numPr>
+        <w:rPr>
+          <w:color w:val="000000"/>
+        </w:rPr>
+      </w:pPr>
+      <w:r>
+        <w:rPr>
+          <w:b/>
+          <w:bCs/>
+          <w:color w:val="000000"/>
+        </w:rPr>
+        <w:t>WEDDINGS</w:t>
+      </w:r>
+    </w:p>
+    <w:p>
+      <w:pPr>
+        <w:pStyle w:val="NormlWeb"/>
+        <w:rPr>
+          <w:rFonts w:eastAsiaTheme="minorHAnsi"/>
+          <w:kern w:val="2"/>
+          <w:sz w:val="32"/>
+          <w:szCs w:val="32"/>
+          <w:u w:val="single"/>
+          <w:lang w:eastAsia="en-US"/>
+          <w14:ligatures w14:val="standardContextual"/>
+        </w:rPr>
+      </w:pPr>
+      <w:r>
+        <w:rPr>
+          <w:rFonts w:eastAsiaTheme="minorHAnsi"/>
+          <w:kern w:val="2"/>
+          <w:sz w:val="32"/>
+          <w:szCs w:val="32"/>
+          <w:u w:val="single"/>
+          <w:lang w:eastAsia="en-US"/>
+          <w14:ligatures w14:val="standardContextual"/>
+        </w:rPr>
+        <w:t>Vélemények (</w:t>
+      </w:r>
+      <w:proofErr w:type="spellStart"/>
+      <w:r>
+        <w:rPr>
+          <w:rFonts w:eastAsiaTheme="minorHAnsi"/>
+          <w:kern w:val="2"/>
+          <w:sz w:val="32"/>
+          <w:szCs w:val="32"/>
+          <w:u w:val="single"/>
+          <w:lang w:eastAsia="en-US"/>
+          <w14:ligatures w14:val="standardContextual"/>
+        </w:rPr>
+        <w:t>Testimonials</w:t>
+      </w:r>
+      <w:proofErr w:type="spellEnd"/>
+      <w:r>
+        <w:rPr>
+          <w:rFonts w:eastAsiaTheme="minorHAnsi"/>
+          <w:kern w:val="2"/>
+          <w:sz w:val="32"/>
+          <w:szCs w:val="32"/>
+          <w:u w:val="single"/>
+          <w:lang w:eastAsia="en-US"/>
+          <w14:ligatures w14:val="standardContextual"/>
+        </w:rPr>
+        <w:t>):</w:t>
+      </w:r>
+    </w:p>
+    <w:p>
+      <w:pPr>
+        <w:pStyle w:val="NormlWeb"/>
+        <w:rPr>
+          <w:rStyle w:val="apple-converted-space"/>
+          <w:color w:val="000000"/>
+        </w:rPr>
+      </w:pPr>
+      <w:proofErr w:type="spellStart"/>
+      <w:r>
+        <w:rPr>
+          <w:b/>
+          <w:bCs/>
+          <w:color w:val="000000"/>
+        </w:rPr>
+        <w:t>Newjság</w:t>
+      </w:r>
+      <w:proofErr w:type="spellEnd"/>
+      <w:r>
+        <w:rPr>
+          <w:rStyle w:val="apple-converted-space"/>
+          <w:color w:val="000000"/>
+        </w:rPr>
+        <w:t> </w:t>
+      </w:r>
+    </w:p>
+    <w:p>
+      <w:pPr>
+        <w:pStyle w:val="NormlWeb"/>
+        <w:rPr>
+          <w:color w:val="000000"/>
+          <w:lang w:val="en-GB"/>
+        </w:rPr>
+      </w:pPr>
+      <w:r>
+        <w:rPr>
+          <w:color w:val="000000"/>
+          <w:lang w:val="en-GB"/>
+        </w:rPr>
+        <w:t xml:space="preserve">"Balázs has captured countless events for </w:t>
+      </w:r>
+      <w:proofErr w:type="spellStart"/>
+      <w:r>
+        <w:rPr>
+          <w:color w:val="000000"/>
+          <w:lang w:val="en-GB"/>
+        </w:rPr>
+        <w:t>Newjság</w:t>
+      </w:r>
+      <w:proofErr w:type="spellEnd"/>
+      <w:r>
+        <w:rPr>
+          <w:color w:val="000000"/>
+          <w:lang w:val="en-GB"/>
+        </w:rPr>
+        <w:t>, and we have loved working with him from day one. What truly sets him apart is his incredible work ethic and constant desire to improve. He never settles for average: at every shoot, he looks for new angles and finer technical solutions to get the absolute most out of a given moment. He is a reliable, dedicated, and humble photographer, whose pictures we have always been proud to feature on our platforms."</w:t>
+      </w:r>
+    </w:p>
+    <w:p>
+      <w:pPr>
+        <w:pStyle w:val="NormlWeb"/>
+        <w:rPr>
+          <w:rStyle w:val="apple-converted-space"/>
+          <w:color w:val="000000"/>
+        </w:rPr>
+      </w:pPr>
+      <w:r>
+        <w:rPr>
+          <w:b/>
+          <w:bCs/>
+          <w:color w:val="000000"/>
+        </w:rPr>
+        <w:lastRenderedPageBreak/>
+        <w:t>Kis Lili</w:t>
+      </w:r>
+      <w:r>
+        <w:rPr>
+          <w:rStyle w:val="apple-converted-space"/>
+          <w:color w:val="000000"/>
+        </w:rPr>
+        <w:t> </w:t>
+      </w:r>
+    </w:p>
+    <w:p>
+      <w:pPr>
+        <w:pStyle w:val="NormlWeb"/>
+        <w:rPr>
+          <w:color w:val="000000"/>
+          <w:lang w:val="en-GB"/>
+        </w:rPr>
+      </w:pPr>
+      <w:r>
+        <w:rPr>
+          <w:color w:val="000000"/>
+          <w:lang w:val="en-GB"/>
+        </w:rPr>
+        <w:t>"We asked Balázs to photograph our wedding, and it was the best decision of our lives! He was with us from the preparations and worked tirelessly until the very end of the reception. He even captured moments during the early morning party that we didn't notice in all the excitement. He was never intrusive, blending into the crowd almost invisibly, yet he was always exactly where he needed to be. The photos are beautiful, natural, and full of emotion. We wholeheartedly recommend him to everyone!"</w:t>
+      </w:r>
+    </w:p>
+    <w:p>
+      <w:pPr>
+        <w:pStyle w:val="NormlWeb"/>
+        <w:rPr>
+          <w:rStyle w:val="apple-converted-space"/>
+          <w:color w:val="000000"/>
+        </w:rPr>
+      </w:pPr>
+      <w:r>
+        <w:rPr>
+          <w:b/>
+          <w:bCs/>
+          <w:color w:val="000000"/>
+        </w:rPr>
+        <w:t>Granárium Zebra Club</w:t>
+      </w:r>
+      <w:r>
+        <w:rPr>
+          <w:rStyle w:val="apple-converted-space"/>
+          <w:color w:val="000000"/>
+        </w:rPr>
+        <w:t> </w:t>
+      </w:r>
+    </w:p>
+    <w:p>
+      <w:pPr>
+        <w:pStyle w:val="NormlWeb"/>
+        <w:rPr>
+          <w:color w:val="000000"/>
+          <w:lang w:val="en-GB"/>
+        </w:rPr>
+      </w:pPr>
+      <w:r>
+        <w:rPr>
+          <w:color w:val="000000"/>
+          <w:lang w:val="en-GB"/>
+        </w:rPr>
+        <w:t>"Balázs has photographed countless amazing nights and sold-out parties for us. In a club setting, it's crucial that the photographer doesn't make the partygoers feel uncomfortable, and he works brilliantly, almost invisibly, yet always finding the best angles in the crowd. The end result is, without exception, premium quality, dynamic imagery that 100% reflects our signature vibe. An incredibly reliable and professional partner!"</w:t>
+      </w:r>
+    </w:p>
+    <w:p>
+      <w:pPr>
+        <w:pStyle w:val="NormlWeb"/>
+        <w:rPr>
+          <w:rStyle w:val="apple-converted-space"/>
+          <w:color w:val="000000"/>
+        </w:rPr>
+      </w:pPr>
+      <w:r>
+        <w:rPr>
+          <w:rFonts w:eastAsiaTheme="minorHAnsi"/>
+          <w:kern w:val="2"/>
+          <w:sz w:val="32"/>
+          <w:szCs w:val="32"/>
+          <w:u w:val="single"/>
+          <w:lang w:eastAsia="en-US"/>
+          <w14:ligatures w14:val="standardContextual"/>
+        </w:rPr>
+        <w:t>Árajánlatkérő:</w:t>
+      </w:r>
+      <w:r>
+        <w:rPr>
+          <w:rStyle w:val="apple-converted-space"/>
+          <w:color w:val="000000"/>
+        </w:rPr>
+        <w:t> </w:t>
+      </w:r>
+    </w:p>
+    <w:p>
+      <w:pPr>
+        <w:pStyle w:val="NormlWeb"/>
+        <w:rPr>
+          <w:color w:val="000000"/>
+        </w:rPr>
+      </w:pPr>
+      <w:r>
+        <w:rPr>
+          <w:i/>
+          <w:iCs/>
+          <w:color w:val="000000"/>
+        </w:rPr>
+        <w:t>Cím:</w:t>
+      </w:r>
+      <w:r>
+        <w:rPr>
+          <w:rStyle w:val="apple-converted-space"/>
+          <w:color w:val="000000"/>
+        </w:rPr>
+        <w:t> </w:t>
+      </w:r>
+      <w:r>
+        <w:rPr>
+          <w:b/>
+          <w:bCs/>
+          <w:color w:val="000000"/>
+        </w:rPr>
+        <w:t xml:space="preserve">~ </w:t>
+      </w:r>
+      <w:proofErr w:type="spellStart"/>
+      <w:r>
+        <w:rPr>
+          <w:b/>
+          <w:bCs/>
+          <w:color w:val="000000"/>
+        </w:rPr>
+        <w:t>Request</w:t>
+      </w:r>
+      <w:proofErr w:type="spellEnd"/>
+      <w:r>
+        <w:rPr>
+          <w:b/>
+          <w:bCs/>
+          <w:color w:val="000000"/>
+        </w:rPr>
+        <w:t xml:space="preserve"> a </w:t>
+      </w:r>
+      <w:proofErr w:type="spellStart"/>
+      <w:r>
+        <w:rPr>
+          <w:b/>
+          <w:bCs/>
+          <w:color w:val="000000"/>
+        </w:rPr>
+        <w:t>Quote</w:t>
+      </w:r>
+      <w:proofErr w:type="spellEnd"/>
+      <w:r>
+        <w:rPr>
+          <w:b/>
+          <w:bCs/>
+          <w:color w:val="000000"/>
+        </w:rPr>
+        <w:t xml:space="preserve"> ~</w:t>
+      </w:r>
+    </w:p>
+    <w:p>
+      <w:pPr>
+        <w:pStyle w:val="NormlWeb"/>
+        <w:rPr>
+          <w:rStyle w:val="apple-converted-space"/>
+          <w:color w:val="000000"/>
+        </w:rPr>
+      </w:pPr>
+      <w:r>
+        <w:rPr>
+          <w:i/>
+          <w:iCs/>
+          <w:color w:val="000000"/>
+        </w:rPr>
+        <w:t>Szöveg:</w:t>
+      </w:r>
+      <w:r>
+        <w:rPr>
+          <w:rStyle w:val="apple-converted-space"/>
+          <w:color w:val="000000"/>
+        </w:rPr>
+        <w:t> </w:t>
+      </w:r>
+    </w:p>
+    <w:p>
+      <w:pPr>
+        <w:pStyle w:val="NormlWeb"/>
+        <w:rPr>
+          <w:color w:val="000000"/>
+          <w:lang w:val="en-GB"/>
+        </w:rPr>
+      </w:pPr>
+      <w:r>
+        <w:rPr>
+          <w:color w:val="000000"/>
+          <w:lang w:val="en-GB"/>
+        </w:rPr>
+        <w:t>Would you like to request a quote? Please fill out the form below, and I will get in touch with you shortly.</w:t>
+      </w:r>
+    </w:p>
+    <w:p>
+      <w:pPr>
+        <w:pStyle w:val="NormlWeb"/>
+        <w:rPr>
+          <w:rStyle w:val="apple-converted-space"/>
+          <w:color w:val="000000"/>
+        </w:rPr>
+      </w:pPr>
+      <w:proofErr w:type="spellStart"/>
+      <w:r>
+        <w:rPr>
+          <w:rFonts w:eastAsiaTheme="minorHAnsi"/>
+          <w:kern w:val="2"/>
+          <w:sz w:val="32"/>
+          <w:szCs w:val="32"/>
+          <w:u w:val="single"/>
+          <w:lang w:eastAsia="en-US"/>
+          <w14:ligatures w14:val="standardContextual"/>
+        </w:rPr>
+        <w:t>Info</w:t>
+      </w:r>
+      <w:proofErr w:type="spellEnd"/>
+      <w:r>
+        <w:rPr>
+          <w:rFonts w:eastAsiaTheme="minorHAnsi"/>
+          <w:kern w:val="2"/>
+          <w:sz w:val="32"/>
+          <w:szCs w:val="32"/>
+          <w:u w:val="single"/>
+          <w:lang w:eastAsia="en-US"/>
+          <w14:ligatures w14:val="standardContextual"/>
+        </w:rPr>
+        <w:t>:</w:t>
+      </w:r>
+      <w:r>
+        <w:rPr>
+          <w:rStyle w:val="apple-converted-space"/>
+          <w:color w:val="000000"/>
+        </w:rPr>
+        <w:t> </w:t>
+      </w:r>
+    </w:p>
+    <w:p>
+      <w:r>
+        <w:t>GET IN TOUCH</w:t>
+      </w:r>
+    </w:p>
+    <w:p>
+      <w:pPr>
+        <w:jc w:val="center"/>
+        <w:rPr>
+          <w:rFonts w:ascii="Times New Roman" w:hAnsi="Times New Roman" w:cs="Times New Roman"/>
+          <w:sz w:val="48"/>
+          <w:szCs w:val="48"/>
         </w:rPr>
       </w:pPr>
     </w:p>
@@ -767,6 +1702,155 @@
     </w:lvl>
   </w:abstractNum>
   <w:abstractNum w:abstractNumId="1" w15:restartNumberingAfterBreak="0">
+    <w:nsid w:val="29777435"/>
+    <w:multiLevelType w:val="multilevel"/>
+    <w:tmpl w:val="E1E6DDAE"/>
+    <w:lvl w:ilvl="0">
+      <w:start w:val="1"/>
+      <w:numFmt w:val="bullet"/>
+      <w:lvlText w:val=""/>
+      <w:lvlJc w:val="left"/>
+      <w:pPr>
+        <w:tabs>
+          <w:tab w:val="num" w:pos="720"/>
+        </w:tabs>
+        <w:ind w:left="720" w:hanging="360"/>
+      </w:pPr>
+      <w:rPr>
+        <w:rFonts w:ascii="Symbol" w:hAnsi="Symbol" w:hint="default"/>
+        <w:sz w:val="20"/>
+      </w:rPr>
+    </w:lvl>
+    <w:lvl w:ilvl="1" w:tentative="1">
+      <w:start w:val="1"/>
+      <w:numFmt w:val="bullet"/>
+      <w:lvlText w:val="o"/>
+      <w:lvlJc w:val="left"/>
+      <w:pPr>
+        <w:tabs>
+          <w:tab w:val="num" w:pos="1440"/>
+        </w:tabs>
+        <w:ind w:left="1440" w:hanging="360"/>
+      </w:pPr>
+      <w:rPr>
+        <w:rFonts w:ascii="Courier New" w:hAnsi="Courier New" w:hint="default"/>
+        <w:sz w:val="20"/>
+      </w:rPr>
+    </w:lvl>
+    <w:lvl w:ilvl="2" w:tentative="1">
+      <w:start w:val="1"/>
+      <w:numFmt w:val="bullet"/>
+      <w:lvlText w:val=""/>
+      <w:lvlJc w:val="left"/>
+      <w:pPr>
+        <w:tabs>
+          <w:tab w:val="num" w:pos="2160"/>
+        </w:tabs>
+        <w:ind w:left="2160" w:hanging="360"/>
+      </w:pPr>
+      <w:rPr>
+        <w:rFonts w:ascii="Wingdings" w:hAnsi="Wingdings" w:hint="default"/>
+        <w:sz w:val="20"/>
+      </w:rPr>
+    </w:lvl>
+    <w:lvl w:ilvl="3" w:tentative="1">
+      <w:start w:val="1"/>
+      <w:numFmt w:val="bullet"/>
+      <w:lvlText w:val=""/>
+      <w:lvlJc w:val="left"/>
+      <w:pPr>
+        <w:tabs>
+          <w:tab w:val="num" w:pos="2880"/>
+        </w:tabs>
+        <w:ind w:left="2880" w:hanging="360"/>
+      </w:pPr>
+      <w:rPr>
+        <w:rFonts w:ascii="Wingdings" w:hAnsi="Wingdings" w:hint="default"/>
+        <w:sz w:val="20"/>
+      </w:rPr>
+    </w:lvl>
+    <w:lvl w:ilvl="4" w:tentative="1">
+      <w:start w:val="1"/>
+      <w:numFmt w:val="bullet"/>
+      <w:lvlText w:val=""/>
+      <w:lvlJc w:val="left"/>
+      <w:pPr>
+        <w:tabs>
+          <w:tab w:val="num" w:pos="3600"/>
+        </w:tabs>
+        <w:ind w:left="3600" w:hanging="360"/>
+      </w:pPr>
+      <w:rPr>
+        <w:rFonts w:ascii="Wingdings" w:hAnsi="Wingdings" w:hint="default"/>
+        <w:sz w:val="20"/>
+      </w:rPr>
+    </w:lvl>
+    <w:lvl w:ilvl="5" w:tentative="1">
+      <w:start w:val="1"/>
+      <w:numFmt w:val="bullet"/>
+      <w:lvlText w:val=""/>
+      <w:lvlJc w:val="left"/>
+      <w:pPr>
+        <w:tabs>
+          <w:tab w:val="num" w:pos="4320"/>
+        </w:tabs>
+        <w:ind w:left="4320" w:hanging="360"/>
+      </w:pPr>
+      <w:rPr>
+        <w:rFonts w:ascii="Wingdings" w:hAnsi="Wingdings" w:hint="default"/>
+        <w:sz w:val="20"/>
+      </w:rPr>
+    </w:lvl>
+    <w:lvl w:ilvl="6" w:tentative="1">
+      <w:start w:val="1"/>
+      <w:numFmt w:val="bullet"/>
+      <w:lvlText w:val=""/>
+      <w:lvlJc w:val="left"/>
+      <w:pPr>
+        <w:tabs>
+          <w:tab w:val="num" w:pos="5040"/>
+        </w:tabs>
+        <w:ind w:left="5040" w:hanging="360"/>
+      </w:pPr>
+      <w:rPr>
+        <w:rFonts w:ascii="Wingdings" w:hAnsi="Wingdings" w:hint="default"/>
+        <w:sz w:val="20"/>
+      </w:rPr>
+    </w:lvl>
+    <w:lvl w:ilvl="7" w:tentative="1">
+      <w:start w:val="1"/>
+      <w:numFmt w:val="bullet"/>
+      <w:lvlText w:val=""/>
+      <w:lvlJc w:val="left"/>
+      <w:pPr>
+        <w:tabs>
+          <w:tab w:val="num" w:pos="5760"/>
+        </w:tabs>
+        <w:ind w:left="5760" w:hanging="360"/>
+      </w:pPr>
+      <w:rPr>
+        <w:rFonts w:ascii="Wingdings" w:hAnsi="Wingdings" w:hint="default"/>
+        <w:sz w:val="20"/>
+      </w:rPr>
+    </w:lvl>
+    <w:lvl w:ilvl="8" w:tentative="1">
+      <w:start w:val="1"/>
+      <w:numFmt w:val="bullet"/>
+      <w:lvlText w:val=""/>
+      <w:lvlJc w:val="left"/>
+      <w:pPr>
+        <w:tabs>
+          <w:tab w:val="num" w:pos="6480"/>
+        </w:tabs>
+        <w:ind w:left="6480" w:hanging="360"/>
+      </w:pPr>
+      <w:rPr>
+        <w:rFonts w:ascii="Wingdings" w:hAnsi="Wingdings" w:hint="default"/>
+        <w:sz w:val="20"/>
+      </w:rPr>
+    </w:lvl>
+  </w:abstractNum>
+  <w:abstractNum w:abstractNumId="2" w15:restartNumberingAfterBreak="0">
     <w:nsid w:val="2E425FAC"/>
     <w:multiLevelType w:val="hybridMultilevel"/>
     <w:tmpl w:val="E5DE25AC"/>
@@ -856,7 +1940,156 @@
       </w:pPr>
     </w:lvl>
   </w:abstractNum>
-  <w:abstractNum w:abstractNumId="2" w15:restartNumberingAfterBreak="0">
+  <w:abstractNum w:abstractNumId="3" w15:restartNumberingAfterBreak="0">
+    <w:nsid w:val="42532772"/>
+    <w:multiLevelType w:val="multilevel"/>
+    <w:tmpl w:val="19F65370"/>
+    <w:lvl w:ilvl="0">
+      <w:start w:val="1"/>
+      <w:numFmt w:val="bullet"/>
+      <w:lvlText w:val=""/>
+      <w:lvlJc w:val="left"/>
+      <w:pPr>
+        <w:tabs>
+          <w:tab w:val="num" w:pos="720"/>
+        </w:tabs>
+        <w:ind w:left="720" w:hanging="360"/>
+      </w:pPr>
+      <w:rPr>
+        <w:rFonts w:ascii="Symbol" w:hAnsi="Symbol" w:hint="default"/>
+        <w:sz w:val="20"/>
+      </w:rPr>
+    </w:lvl>
+    <w:lvl w:ilvl="1" w:tentative="1">
+      <w:start w:val="1"/>
+      <w:numFmt w:val="bullet"/>
+      <w:lvlText w:val="o"/>
+      <w:lvlJc w:val="left"/>
+      <w:pPr>
+        <w:tabs>
+          <w:tab w:val="num" w:pos="1440"/>
+        </w:tabs>
+        <w:ind w:left="1440" w:hanging="360"/>
+      </w:pPr>
+      <w:rPr>
+        <w:rFonts w:ascii="Courier New" w:hAnsi="Courier New" w:hint="default"/>
+        <w:sz w:val="20"/>
+      </w:rPr>
+    </w:lvl>
+    <w:lvl w:ilvl="2" w:tentative="1">
+      <w:start w:val="1"/>
+      <w:numFmt w:val="bullet"/>
+      <w:lvlText w:val=""/>
+      <w:lvlJc w:val="left"/>
+      <w:pPr>
+        <w:tabs>
+          <w:tab w:val="num" w:pos="2160"/>
+        </w:tabs>
+        <w:ind w:left="2160" w:hanging="360"/>
+      </w:pPr>
+      <w:rPr>
+        <w:rFonts w:ascii="Wingdings" w:hAnsi="Wingdings" w:hint="default"/>
+        <w:sz w:val="20"/>
+      </w:rPr>
+    </w:lvl>
+    <w:lvl w:ilvl="3" w:tentative="1">
+      <w:start w:val="1"/>
+      <w:numFmt w:val="bullet"/>
+      <w:lvlText w:val=""/>
+      <w:lvlJc w:val="left"/>
+      <w:pPr>
+        <w:tabs>
+          <w:tab w:val="num" w:pos="2880"/>
+        </w:tabs>
+        <w:ind w:left="2880" w:hanging="360"/>
+      </w:pPr>
+      <w:rPr>
+        <w:rFonts w:ascii="Wingdings" w:hAnsi="Wingdings" w:hint="default"/>
+        <w:sz w:val="20"/>
+      </w:rPr>
+    </w:lvl>
+    <w:lvl w:ilvl="4" w:tentative="1">
+      <w:start w:val="1"/>
+      <w:numFmt w:val="bullet"/>
+      <w:lvlText w:val=""/>
+      <w:lvlJc w:val="left"/>
+      <w:pPr>
+        <w:tabs>
+          <w:tab w:val="num" w:pos="3600"/>
+        </w:tabs>
+        <w:ind w:left="3600" w:hanging="360"/>
+      </w:pPr>
+      <w:rPr>
+        <w:rFonts w:ascii="Wingdings" w:hAnsi="Wingdings" w:hint="default"/>
+        <w:sz w:val="20"/>
+      </w:rPr>
+    </w:lvl>
+    <w:lvl w:ilvl="5" w:tentative="1">
+      <w:start w:val="1"/>
+      <w:numFmt w:val="bullet"/>
+      <w:lvlText w:val=""/>
+      <w:lvlJc w:val="left"/>
+      <w:pPr>
+        <w:tabs>
+          <w:tab w:val="num" w:pos="4320"/>
+        </w:tabs>
+        <w:ind w:left="4320" w:hanging="360"/>
+      </w:pPr>
+      <w:rPr>
+        <w:rFonts w:ascii="Wingdings" w:hAnsi="Wingdings" w:hint="default"/>
+        <w:sz w:val="20"/>
+      </w:rPr>
+    </w:lvl>
+    <w:lvl w:ilvl="6" w:tentative="1">
+      <w:start w:val="1"/>
+      <w:numFmt w:val="bullet"/>
+      <w:lvlText w:val=""/>
+      <w:lvlJc w:val="left"/>
+      <w:pPr>
+        <w:tabs>
+          <w:tab w:val="num" w:pos="5040"/>
+        </w:tabs>
+        <w:ind w:left="5040" w:hanging="360"/>
+      </w:pPr>
+      <w:rPr>
+        <w:rFonts w:ascii="Wingdings" w:hAnsi="Wingdings" w:hint="default"/>
+        <w:sz w:val="20"/>
+      </w:rPr>
+    </w:lvl>
+    <w:lvl w:ilvl="7" w:tentative="1">
+      <w:start w:val="1"/>
+      <w:numFmt w:val="bullet"/>
+      <w:lvlText w:val=""/>
+      <w:lvlJc w:val="left"/>
+      <w:pPr>
+        <w:tabs>
+          <w:tab w:val="num" w:pos="5760"/>
+        </w:tabs>
+        <w:ind w:left="5760" w:hanging="360"/>
+      </w:pPr>
+      <w:rPr>
+        <w:rFonts w:ascii="Wingdings" w:hAnsi="Wingdings" w:hint="default"/>
+        <w:sz w:val="20"/>
+      </w:rPr>
+    </w:lvl>
+    <w:lvl w:ilvl="8" w:tentative="1">
+      <w:start w:val="1"/>
+      <w:numFmt w:val="bullet"/>
+      <w:lvlText w:val=""/>
+      <w:lvlJc w:val="left"/>
+      <w:pPr>
+        <w:tabs>
+          <w:tab w:val="num" w:pos="6480"/>
+        </w:tabs>
+        <w:ind w:left="6480" w:hanging="360"/>
+      </w:pPr>
+      <w:rPr>
+        <w:rFonts w:ascii="Wingdings" w:hAnsi="Wingdings" w:hint="default"/>
+        <w:sz w:val="20"/>
+      </w:rPr>
+    </w:lvl>
+  </w:abstractNum>
+  <w:abstractNum w:abstractNumId="4" w15:restartNumberingAfterBreak="0">
     <w:nsid w:val="654D0FDA"/>
     <w:multiLevelType w:val="hybridMultilevel"/>
     <w:tmpl w:val="8F6A4182"/>
@@ -969,14 +2202,113 @@
       </w:rPr>
     </w:lvl>
   </w:abstractNum>
+  <w:abstractNum w:abstractNumId="5" w15:restartNumberingAfterBreak="0">
+    <w:nsid w:val="6A9477EF"/>
+    <w:multiLevelType w:val="hybridMultilevel"/>
+    <w:tmpl w:val="7090A22E"/>
+    <w:lvl w:ilvl="0" w:tplc="8F38CA1E">
+      <w:start w:val="1"/>
+      <w:numFmt w:val="decimal"/>
+      <w:lvlText w:val="%1."/>
+      <w:lvlJc w:val="left"/>
+      <w:pPr>
+        <w:ind w:left="720" w:hanging="360"/>
+      </w:pPr>
+      <w:rPr>
+        <w:rFonts w:hint="default"/>
+        <w:i/>
+      </w:rPr>
+    </w:lvl>
+    <w:lvl w:ilvl="1" w:tplc="040E0019" w:tentative="1">
+      <w:start w:val="1"/>
+      <w:numFmt w:val="lowerLetter"/>
+      <w:lvlText w:val="%2."/>
+      <w:lvlJc w:val="left"/>
+      <w:pPr>
+        <w:ind w:left="1440" w:hanging="360"/>
+      </w:pPr>
+    </w:lvl>
+    <w:lvl w:ilvl="2" w:tplc="040E001B" w:tentative="1">
+      <w:start w:val="1"/>
+      <w:numFmt w:val="lowerRoman"/>
+      <w:lvlText w:val="%3."/>
+      <w:lvlJc w:val="right"/>
+      <w:pPr>
+        <w:ind w:left="2160" w:hanging="180"/>
+      </w:pPr>
+    </w:lvl>
+    <w:lvl w:ilvl="3" w:tplc="040E000F" w:tentative="1">
+      <w:start w:val="1"/>
+      <w:numFmt w:val="decimal"/>
+      <w:lvlText w:val="%4."/>
+      <w:lvlJc w:val="left"/>
+      <w:pPr>
+        <w:ind w:left="2880" w:hanging="360"/>
+      </w:pPr>
+    </w:lvl>
+    <w:lvl w:ilvl="4" w:tplc="040E0019" w:tentative="1">
+      <w:start w:val="1"/>
+      <w:numFmt w:val="lowerLetter"/>
+      <w:lvlText w:val="%5."/>
+      <w:lvlJc w:val="left"/>
+      <w:pPr>
+        <w:ind w:left="3600" w:hanging="360"/>
+      </w:pPr>
+    </w:lvl>
+    <w:lvl w:ilvl="5" w:tplc="040E001B" w:tentative="1">
+      <w:start w:val="1"/>
+      <w:numFmt w:val="lowerRoman"/>
+      <w:lvlText w:val="%6."/>
+      <w:lvlJc w:val="right"/>
+      <w:pPr>
+        <w:ind w:left="4320" w:hanging="180"/>
+      </w:pPr>
+    </w:lvl>
+    <w:lvl w:ilvl="6" w:tplc="040E000F" w:tentative="1">
+      <w:start w:val="1"/>
+      <w:numFmt w:val="decimal"/>
+      <w:lvlText w:val="%7."/>
+      <w:lvlJc w:val="left"/>
+      <w:pPr>
+        <w:ind w:left="5040" w:hanging="360"/>
+      </w:pPr>
+    </w:lvl>
+    <w:lvl w:ilvl="7" w:tplc="040E0019" w:tentative="1">
+      <w:start w:val="1"/>
+      <w:numFmt w:val="lowerLetter"/>
+      <w:lvlText w:val="%8."/>
+      <w:lvlJc w:val="left"/>
+      <w:pPr>
+        <w:ind w:left="5760" w:hanging="360"/>
+      </w:pPr>
+    </w:lvl>
+    <w:lvl w:ilvl="8" w:tplc="040E001B" w:tentative="1">
+      <w:start w:val="1"/>
+      <w:numFmt w:val="lowerRoman"/>
+      <w:lvlText w:val="%9."/>
+      <w:lvlJc w:val="right"/>
+      <w:pPr>
+        <w:ind w:left="6480" w:hanging="180"/>
+      </w:pPr>
+    </w:lvl>
+  </w:abstractNum>
   <w:num w:numId="1" w16cid:durableId="1267805839">
-    <w:abstractNumId w:val="2"/>
+    <w:abstractNumId w:val="4"/>
   </w:num>
   <w:num w:numId="2" w16cid:durableId="474565824">
-    <w:abstractNumId w:val="1"/>
+    <w:abstractNumId w:val="2"/>
   </w:num>
   <w:num w:numId="3" w16cid:durableId="1000238256">
     <w:abstractNumId w:val="0"/>
+  </w:num>
+  <w:num w:numId="4" w16cid:durableId="834733086">
+    <w:abstractNumId w:val="3"/>
+  </w:num>
+  <w:num w:numId="5" w16cid:durableId="144199980">
+    <w:abstractNumId w:val="1"/>
+  </w:num>
+  <w:num w:numId="6" w16cid:durableId="214859345">
+    <w:abstractNumId w:val="5"/>
   </w:num>
 </w:numbering>
 </file>

</xml_diff>